<commit_message>
final revision 3 is completely updated
final revision 3 is completely updated
</commit_message>
<xml_diff>
--- a/JEEMI/Revision 2/Editor's Comment.docx
+++ b/JEEMI/Revision 2/Editor's Comment.docx
@@ -4,6 +4,42 @@
   <w:body>
     <w:p>
       <w:pPr>
+        <w:tabs>
+          <w:tab w:val="num" w:pos="720"/>
+        </w:tabs>
+        <w:ind w:left="720" w:hanging="360"/>
+        <w:jc w:val="center"/>
+        <w:rPr>
+          <w:b/>
+          <w:bCs/>
+          <w:sz w:val="40"/>
+          <w:szCs w:val="40"/>
+        </w:rPr>
+      </w:pPr>
+      <w:r>
+        <w:rPr>
+          <w:b/>
+          <w:bCs/>
+          <w:sz w:val="40"/>
+          <w:szCs w:val="40"/>
+        </w:rPr>
+        <w:t>Editor’s main comment and answers</w:t>
+      </w:r>
+    </w:p>
+    <w:p>
+      <w:pPr>
+        <w:ind w:left="720"/>
+        <w:jc w:val="both"/>
+      </w:pPr>
+    </w:p>
+    <w:p>
+      <w:pPr>
+        <w:ind w:left="720"/>
+        <w:jc w:val="both"/>
+      </w:pPr>
+    </w:p>
+    <w:p>
+      <w:pPr>
         <w:numPr>
           <w:ilvl w:val="0"/>
           <w:numId w:val="1"/>
@@ -95,23 +131,7 @@
         <w:jc w:val="both"/>
       </w:pPr>
       <w:r>
-        <w:t xml:space="preserve">Figure 2 illustrates the SE-block architecture and is relevant, but its resolution is relatively low and labels are difficult to read. A higher-resolution/vector version should be supplied. All symbols used in the figure should also correspond directly to those defined in </w:t>
-      </w:r>
-      <w:proofErr w:type="spellStart"/>
-      <w:r>
-        <w:t>Eqs</w:t>
-      </w:r>
-      <w:proofErr w:type="spellEnd"/>
-      <w:r>
-        <w:t>. (1)</w:t>
-      </w:r>
-      <w:proofErr w:type="gramStart"/>
-      <w:r>
-        <w:t>–(</w:t>
-      </w:r>
-      <w:proofErr w:type="gramEnd"/>
-      <w:r>
-        <w:t>4).</w:t>
+        <w:t>Figure 2 illustrates the SE-block architecture and is relevant, but its resolution is relatively low and labels are difficult to read. A higher-resolution/vector version should be supplied. All symbols used in the figure should also correspond directly to those defined in Eqs. (1)–(4).</w:t>
       </w:r>
     </w:p>
     <w:p>
@@ -141,6 +161,7 @@
         <w:jc w:val="both"/>
       </w:pPr>
       <w:r>
+        <w:lastRenderedPageBreak/>
         <w:t>Thank you for the valuable comment. The figure and its source attribution have been carefully reviewed, and the caption has been appropriately clarified to acknowledge the relevant reference and ensure compliance with applicable copyright requirements.</w:t>
       </w:r>
     </w:p>
@@ -153,154 +174,148 @@
         <w:jc w:val="both"/>
       </w:pPr>
       <w:r>
+        <w:t>Figure 3 is a generic max-pooling illustration rather than a result generated by the study. Its scientific necessity should be reconsidered. Because max pooling is standard, this figure could be removed and the explanation retained in the text, reducing unnecessary figure count.</w:t>
+      </w:r>
+    </w:p>
+    <w:p>
+      <w:pPr>
+        <w:ind w:left="720"/>
+        <w:jc w:val="both"/>
+      </w:pPr>
+      <w:r>
+        <w:t>Thank you for the valuable comment. Figure 3 has been retained because it provides a concise visual representation of the max-pooling operation used for spatial downsampling in the proposed CNN-SE architecture. It complements the architectural description by illustrating how the spatial dimensions are reduced while preserving the most prominent activation within each pooling window.</w:t>
+      </w:r>
+    </w:p>
+    <w:p>
+      <w:pPr>
+        <w:numPr>
+          <w:ilvl w:val="0"/>
+          <w:numId w:val="1"/>
+        </w:numPr>
+        <w:jc w:val="both"/>
+      </w:pPr>
+      <w:r>
+        <w:t>Figure 3 should also include a source or adaptation citation if the illustration was not created independently by the authors. The current caption does not make its origin clear.</w:t>
+      </w:r>
+    </w:p>
+    <w:p>
+      <w:pPr>
+        <w:ind w:left="720"/>
+        <w:jc w:val="both"/>
+      </w:pPr>
+      <w:r>
+        <w:t>Thank you for the valuable comment. Figure 3 was independently created and implemented by the authors to illustrate the max-pooling operation used in the proposed architecture. Therefore, no external source or adaptation citation is required for this figure.</w:t>
+      </w:r>
+    </w:p>
+    <w:p>
+      <w:pPr>
+        <w:numPr>
+          <w:ilvl w:val="0"/>
+          <w:numId w:val="1"/>
+        </w:numPr>
+        <w:jc w:val="both"/>
+      </w:pPr>
+      <w:r>
+        <w:t>Figure 4 presents two confusion matrices, but the caption should clearly identify the panels as “(a) OCT2017” and “(b) OCT-C8.” The current wording “OCT2017(left) and OCT-C8(right)” should be standardized.</w:t>
+      </w:r>
+    </w:p>
+    <w:p>
+      <w:pPr>
+        <w:ind w:left="720"/>
+        <w:jc w:val="both"/>
+      </w:pPr>
+      <w:r>
+        <w:t>Thank you for the valuable comment. The caption of Figure 4 has been standardized to clearly identify the two panels as “(a) OCT2017” and “(b) OCT-C8,” ensuring consistent and unambiguous presentation.</w:t>
+      </w:r>
+    </w:p>
+    <w:p>
+      <w:pPr>
+        <w:numPr>
+          <w:ilvl w:val="0"/>
+          <w:numId w:val="1"/>
+        </w:numPr>
+        <w:jc w:val="both"/>
+      </w:pPr>
+      <w:r>
+        <w:t>Figure 4 should provide sufficiently large class labels, axis labels, and numerical annotations. At journal-size reproduction, the numbers and class names appear relatively small. Increasing font size and resolution would improve readability.</w:t>
+      </w:r>
+    </w:p>
+    <w:p>
+      <w:pPr>
+        <w:ind w:left="720"/>
+        <w:jc w:val="both"/>
+      </w:pPr>
+      <w:r>
+        <w:t>T</w:t>
+      </w:r>
+      <w:r>
+        <w:t>hank you for the valuable comment. The class labels, axis labels, and numerical annotations in Figure 4 have been reviewed and enlarged to improve their clarity and readability at the final journal reproduction size.</w:t>
+      </w:r>
+    </w:p>
+    <w:p>
+      <w:pPr>
+        <w:numPr>
+          <w:ilvl w:val="0"/>
+          <w:numId w:val="1"/>
+        </w:numPr>
+        <w:jc w:val="both"/>
+      </w:pPr>
+      <w:r>
+        <w:t>Figure 4 should report whether the confusion matrices show raw counts or normalized values. They currently appear to present counts. The caption should explicitly state this.</w:t>
+      </w:r>
+    </w:p>
+    <w:p>
+      <w:pPr>
+        <w:ind w:left="720"/>
+        <w:jc w:val="both"/>
+      </w:pPr>
+      <w:r>
+        <w:t>Thank you for the valuable comment. The confusion matrices in Figure 4 present raw class-wise prediction counts, rather than normalized values. This has been explicitly clarified in the figure caption to avoid any ambiguity.</w:t>
+      </w:r>
+    </w:p>
+    <w:p>
+      <w:pPr>
+        <w:numPr>
+          <w:ilvl w:val="0"/>
+          <w:numId w:val="1"/>
+        </w:numPr>
+        <w:jc w:val="both"/>
+      </w:pPr>
+      <w:r>
+        <w:t>The OCT-C8 confusion matrix in Figure 4 should be carefully cross-checked against Table 3. For example, class-wise recall values should be reproducible from the matrix. The authors should verify every precision, recall, and F1 value against the underlying confusion-matrix counts.</w:t>
+      </w:r>
+    </w:p>
+    <w:p>
+      <w:pPr>
+        <w:ind w:left="720"/>
+        <w:jc w:val="both"/>
+      </w:pPr>
+      <w:r>
+        <w:t>Thank you for the valuable comment. The OCT-C8 confusion matrix and Table 3 have been carefully cross-checked, and the class-wise precision, recall, and F1-score values have been verified and corrected based on the underlying confusion-matrix counts.</w:t>
+      </w:r>
+    </w:p>
+    <w:p>
+      <w:pPr>
+        <w:numPr>
+          <w:ilvl w:val="0"/>
+          <w:numId w:val="1"/>
+        </w:numPr>
+        <w:jc w:val="both"/>
+      </w:pPr>
+      <w:r>
+        <w:t xml:space="preserve">Figures 5 and 6 appropriately show training/validation loss and accuracy, respectively. However, the manuscript text states convergence occurred at epoch 31 for OCT2017 and </w:t>
+      </w:r>
+      <w:r>
         <w:lastRenderedPageBreak/>
-        <w:t>Figure 3 is a generic max-pooling illustration rather than a result generated by the study. Its scientific necessity should be reconsidered. Because max pooling is standard, this figure could be removed and the explanation retained in the text, reducing unnecessary figure count.</w:t>
-      </w:r>
-    </w:p>
-    <w:p>
-      <w:pPr>
-        <w:ind w:left="720"/>
-        <w:jc w:val="both"/>
-      </w:pPr>
-      <w:r>
-        <w:t xml:space="preserve">Thank you for the valuable comment. Figure 3 has been retained because it provides a concise visual representation of the max-pooling operation used for spatial </w:t>
-      </w:r>
-      <w:proofErr w:type="spellStart"/>
-      <w:r>
-        <w:t>downsampling</w:t>
-      </w:r>
-      <w:proofErr w:type="spellEnd"/>
-      <w:r>
-        <w:t xml:space="preserve"> in the proposed CNN-SE architecture. It complements the architectural description by illustrating how the spatial dimensions are reduced while preserving the most prominent activation within each pooling window.</w:t>
-      </w:r>
-    </w:p>
-    <w:p>
-      <w:pPr>
-        <w:numPr>
-          <w:ilvl w:val="0"/>
-          <w:numId w:val="1"/>
-        </w:numPr>
-        <w:jc w:val="both"/>
-      </w:pPr>
-      <w:r>
-        <w:t>Figure 3 should also include a source or adaptation citation if the illustration was not created independently by the authors. The current caption does not make its origin clear.</w:t>
-      </w:r>
-    </w:p>
-    <w:p>
-      <w:pPr>
-        <w:ind w:left="720"/>
-        <w:jc w:val="both"/>
-      </w:pPr>
-      <w:r>
-        <w:t>Thank you for the valuable comment. Figure 3 was independently created and implemented by the authors to illustrate the max-pooling operation used in the proposed architecture. Therefore, no external source or adaptation citation is required for this figure.</w:t>
-      </w:r>
-    </w:p>
-    <w:p>
-      <w:pPr>
-        <w:numPr>
-          <w:ilvl w:val="0"/>
-          <w:numId w:val="1"/>
-        </w:numPr>
-        <w:jc w:val="both"/>
-      </w:pPr>
-      <w:r>
-        <w:t>Figure 4 presents two confusion matrices, but the caption should clearly identify the panels as “(a) OCT2017” and “(b) OCT-C8.” The current wording “OCT2017(left) and OCT-C8(right)” should be standardized.</w:t>
-      </w:r>
-    </w:p>
-    <w:p>
-      <w:pPr>
-        <w:ind w:left="720"/>
-        <w:jc w:val="both"/>
-      </w:pPr>
-      <w:r>
-        <w:t>Thank you for the valuable comment. The caption of Figure 4 has been standardized to clearly identify the two panels as “(a) OCT2017” and “(b) OCT-C8,” ensuring consistent and unambiguous presentation.</w:t>
-      </w:r>
-    </w:p>
-    <w:p>
-      <w:pPr>
-        <w:numPr>
-          <w:ilvl w:val="0"/>
-          <w:numId w:val="1"/>
-        </w:numPr>
-        <w:jc w:val="both"/>
-      </w:pPr>
-      <w:r>
-        <w:t>Figure 4 should provide sufficiently large class labels, axis labels, and numerical annotations. At journal-size reproduction, the numbers and class names appear relatively small. Increasing font size and resolution would improve readability.</w:t>
-      </w:r>
-    </w:p>
-    <w:p>
-      <w:pPr>
-        <w:ind w:left="720"/>
-        <w:jc w:val="both"/>
-      </w:pPr>
-      <w:r>
-        <w:t>T</w:t>
-      </w:r>
-      <w:r>
-        <w:t>hank you for the valuable comment. The class labels, axis labels, and numerical annotations in Figure 4 have been reviewed and enlarged to improve their clarity and readability at the final journal reproduction size.</w:t>
-      </w:r>
-    </w:p>
-    <w:p>
-      <w:pPr>
-        <w:numPr>
-          <w:ilvl w:val="0"/>
-          <w:numId w:val="1"/>
-        </w:numPr>
-        <w:jc w:val="both"/>
-      </w:pPr>
-      <w:r>
-        <w:t>Figure 4 should report whether the confusion matrices show raw counts or normalized values. They currently appear to present counts. The caption should explicitly state this.</w:t>
-      </w:r>
-    </w:p>
-    <w:p>
-      <w:pPr>
-        <w:ind w:left="720"/>
-        <w:jc w:val="both"/>
-      </w:pPr>
-      <w:r>
-        <w:t>Thank you for the valuable comment. The confusion matrices in Figure 4 present raw class-wise prediction counts, rather than normalized values. This has been explicitly clarified in the figure caption to avoid any ambiguity.</w:t>
-      </w:r>
-    </w:p>
-    <w:p>
-      <w:pPr>
-        <w:numPr>
-          <w:ilvl w:val="0"/>
-          <w:numId w:val="1"/>
-        </w:numPr>
-        <w:jc w:val="both"/>
-      </w:pPr>
-      <w:r>
-        <w:t>The OCT-C8 confusion matrix in Figure 4 should be carefully cross-checked against Table 3. For example, class-wise recall values should be reproducible from the matrix. The authors should verify every precision, recall, and F1 value against the underlying confusion-matrix counts.</w:t>
-      </w:r>
-    </w:p>
-    <w:p>
-      <w:pPr>
-        <w:ind w:left="720"/>
-        <w:jc w:val="both"/>
-      </w:pPr>
-      <w:r>
-        <w:t>Thank you for the valuable comment. The OCT-C8 confusion matrix and Table 3 have been carefully cross-checked, and the class-wise precision, recall, and F1-score values have been verified and corrected based on the underlying confusion-matrix counts.</w:t>
-      </w:r>
-    </w:p>
-    <w:p>
-      <w:pPr>
-        <w:numPr>
-          <w:ilvl w:val="0"/>
-          <w:numId w:val="1"/>
-        </w:numPr>
-        <w:jc w:val="both"/>
-      </w:pPr>
-      <w:r>
-        <w:t>Figures 5 and 6 appropriately show training/validation loss and accuracy, respectively. However, the manuscript text states convergence occurred at epoch 31 for OCT2017 and epoch 63 for OCT-C8, whereas the plotted epoch ranges appear to extend beyond these values. The authors should clarify whether the plots show all epochs before early stopping or another training run.</w:t>
-      </w:r>
-    </w:p>
-    <w:p>
-      <w:pPr>
-        <w:ind w:left="720"/>
-        <w:jc w:val="both"/>
-      </w:pPr>
-      <w:r>
-        <w:lastRenderedPageBreak/>
+        <w:t>epoch 63 for OCT-C8, whereas the plotted epoch ranges appear to extend beyond these values. The authors should clarify whether the plots show all epochs before early stopping or another training run.</w:t>
+      </w:r>
+    </w:p>
+    <w:p>
+      <w:pPr>
+        <w:ind w:left="720"/>
+        <w:jc w:val="both"/>
+      </w:pPr>
+      <w:r>
         <w:t>Thank you for the valuable comment. We have carefully cross-checked the training curves with the early-stopping criterion (</w:t>
       </w:r>
       <w:r>
@@ -437,24 +452,36 @@
         <w:jc w:val="both"/>
       </w:pPr>
       <w:r>
-        <w:t>Thank you for the valuable comment. The manuscript already clarifies that Grad-CAM provides an explanatory interpretation of model predictions rather than causal or clinically validated localization. This limitation is also considered in the interpretation of the Grad-CAM results.</w:t>
-      </w:r>
-    </w:p>
-    <w:p>
-      <w:pPr>
-        <w:numPr>
-          <w:ilvl w:val="0"/>
-          <w:numId w:val="1"/>
-        </w:numPr>
-        <w:jc w:val="both"/>
-      </w:pPr>
+        <w:t xml:space="preserve">Thank you for the valuable comment. The manuscript already clarifies that Grad-CAM provides an explanatory interpretation of model predictions rather than causal or clinically </w:t>
+      </w:r>
       <w:r>
         <w:lastRenderedPageBreak/>
+        <w:t>validated localization. This limitation is also considered in the interpretation of the Grad-CAM results.</w:t>
+      </w:r>
+    </w:p>
+    <w:p>
+      <w:pPr>
+        <w:numPr>
+          <w:ilvl w:val="0"/>
+          <w:numId w:val="1"/>
+        </w:numPr>
+        <w:jc w:val="both"/>
+      </w:pPr>
+      <w:r>
         <w:t>Table 1 is useful as a literature comparison, but several entries contain incomplete or potentially inconsistent information. For example, the dataset for Diao et al. [24] is listed as “Not specified.” The original source should be checked and the correct dataset added if available.</w:t>
       </w:r>
     </w:p>
     <w:p>
       <w:pPr>
+        <w:ind w:left="720"/>
+        <w:jc w:val="both"/>
+      </w:pPr>
+      <w:r>
+        <w:t>Thank you for the valuable comment. The entries in Table 1 have been carefully reviewed against the corresponding original references, and the available dataset information has been clarified and updated where applicable.</w:t>
+      </w:r>
+    </w:p>
+    <w:p>
+      <w:pPr>
         <w:numPr>
           <w:ilvl w:val="0"/>
           <w:numId w:val="1"/>
@@ -467,22 +494,32 @@
     </w:p>
     <w:p>
       <w:pPr>
-        <w:numPr>
-          <w:ilvl w:val="0"/>
-          <w:numId w:val="1"/>
-        </w:numPr>
-        <w:jc w:val="both"/>
-      </w:pPr>
-      <w:r>
-        <w:t xml:space="preserve">Table 1 contains author-name formatting inconsistencies, such as “Y.-Y. Liu et al.,” “Yang J et al.,” “Hassan E et al.,” and “Dave and </w:t>
-      </w:r>
-      <w:proofErr w:type="spellStart"/>
-      <w:r>
-        <w:t>Domadiya</w:t>
-      </w:r>
-      <w:proofErr w:type="spellEnd"/>
-      <w:r>
-        <w:t xml:space="preserve"> et al.” The author format should be standardized.</w:t>
+        <w:ind w:left="720"/>
+        <w:jc w:val="both"/>
+      </w:pPr>
+      <w:r>
+        <w:t>Thank you for the valuable comment. Table 1 is intended to provide a concise literature review and methodological comparison, highlighting the datasets, approaches, and limitations of existing studies. A detailed quantitative performance comparison, including accuracy and other evaluation metrics, is provided separately in Table 9, where the proposed method is compared with relevant existing approaches.</w:t>
+      </w:r>
+    </w:p>
+    <w:p>
+      <w:pPr>
+        <w:numPr>
+          <w:ilvl w:val="0"/>
+          <w:numId w:val="1"/>
+        </w:numPr>
+        <w:jc w:val="both"/>
+      </w:pPr>
+      <w:r>
+        <w:t>Table 1 contains author-name formatting inconsistencies, such as “Y.-Y. Liu et al.,” “Yang J et al.,” “Hassan E et al.,” and “Dave and Domadiya et al.” The author format should be standardized.</w:t>
+      </w:r>
+    </w:p>
+    <w:p>
+      <w:pPr>
+        <w:ind w:left="720"/>
+        <w:jc w:val="both"/>
+      </w:pPr>
+      <w:r>
+        <w:t>Thank you for the valuable comment. The author-name formatting in Table 1 has been carefully reviewed and standardized by consistently using the first author’s surname followed by “et al.” for multi-author studies, while retaining the “Surname and Surname” format for studies with two authors.</w:t>
       </w:r>
     </w:p>
     <w:p>
@@ -499,6 +536,15 @@
     </w:p>
     <w:p>
       <w:pPr>
+        <w:ind w:left="720"/>
+        <w:jc w:val="both"/>
+      </w:pPr>
+      <w:r>
+        <w:t>Thank you for the valuable comment. The rotation angle has been clarified by specifying the unit as 20°; the remaining augmentation parameters use standard conventions commonly understood in the machine-learning community, and their existing numerical values have therefore been retained.</w:t>
+      </w:r>
+    </w:p>
+    <w:p>
+      <w:pPr>
         <w:numPr>
           <w:ilvl w:val="0"/>
           <w:numId w:val="1"/>
@@ -511,22 +557,33 @@
     </w:p>
     <w:p>
       <w:pPr>
-        <w:numPr>
-          <w:ilvl w:val="0"/>
-          <w:numId w:val="1"/>
-        </w:numPr>
-        <w:jc w:val="both"/>
-      </w:pPr>
-      <w:r>
-        <w:t xml:space="preserve">Table 3 has a formatting issue: “Recall” is split across lines and several entries use “Class Not Available.” This should instead use an </w:t>
-      </w:r>
-      <w:proofErr w:type="spellStart"/>
-      <w:r>
-        <w:t>em</w:t>
-      </w:r>
-      <w:proofErr w:type="spellEnd"/>
-      <w:r>
-        <w:t xml:space="preserve"> dash, “N/A,” or preferably restructure the table so only relevant classes are shown for each dataset.</w:t>
+        <w:ind w:left="720"/>
+        <w:jc w:val="both"/>
+      </w:pPr>
+      <w:r>
+        <w:t>Thank you for the valuable comment. The term “Height shift” in Table 2 has been replaced with the more conventional term “Vertical shift” to ensure clearer and more consistent description of the image augmentation parameters.</w:t>
+      </w:r>
+    </w:p>
+    <w:p>
+      <w:pPr>
+        <w:numPr>
+          <w:ilvl w:val="0"/>
+          <w:numId w:val="1"/>
+        </w:numPr>
+        <w:jc w:val="both"/>
+      </w:pPr>
+      <w:r>
+        <w:t>Table 3 has a formatting issue: “Recall” is split across lines and several entries use “Class Not Available.” This should instead use an em dash, “N/A,” or preferably restructure the table so only relevant classes are shown for each dataset.</w:t>
+      </w:r>
+    </w:p>
+    <w:p>
+      <w:pPr>
+        <w:ind w:left="720"/>
+        <w:jc w:val="both"/>
+      </w:pPr>
+      <w:r>
+        <w:lastRenderedPageBreak/>
+        <w:t>Thank you for the valuable comment. Table 3 has been reformatted to improve the readability of the column headings, particularly “Recall,” and “Class Not Available” has been replaced with “N/A” for classes that are not applicable to the corresponding dataset.</w:t>
       </w:r>
     </w:p>
     <w:p>
@@ -543,6 +600,15 @@
     </w:p>
     <w:p>
       <w:pPr>
+        <w:ind w:left="720"/>
+        <w:jc w:val="both"/>
+      </w:pPr>
+      <w:r>
+        <w:t>Thank you for the valuable comment. The values 0.99 and 0.97 in Table 3 are the standard decimal/proportion representations directly obtained from the machine-learning evaluation output, which correspond to 99% and 97%, respectively, when expressed as percentages. This decimal representation is commonly used for classification metrics in machine-learning implementations and has therefore been retained.</w:t>
+      </w:r>
+    </w:p>
+    <w:p>
+      <w:pPr>
         <w:numPr>
           <w:ilvl w:val="0"/>
           <w:numId w:val="1"/>
@@ -555,6 +621,15 @@
     </w:p>
     <w:p>
       <w:pPr>
+        <w:ind w:left="720"/>
+        <w:jc w:val="both"/>
+      </w:pPr>
+      <w:r>
+        <w:t>Thank you for the valuable comment. The discrepancy was due to a typing/rounding inconsistency, and the OCT-C8 overall accuracy has been standardized to 97% throughout the revised manuscript for consistency with the reported results.</w:t>
+      </w:r>
+    </w:p>
+    <w:p>
+      <w:pPr>
         <w:numPr>
           <w:ilvl w:val="0"/>
           <w:numId w:val="1"/>
@@ -567,6 +642,15 @@
     </w:p>
     <w:p>
       <w:pPr>
+        <w:ind w:left="720"/>
+        <w:jc w:val="both"/>
+      </w:pPr>
+      <w:r>
+        <w:t>Thank you for the valuable comment. Table 4 presents the summary statistics (mean ± standard deviation) across the five random seeds, and the individual seed-wise results are not included in the table to maintain a concise presentation of the cross-dataset evaluation.</w:t>
+      </w:r>
+    </w:p>
+    <w:p>
+      <w:pPr>
         <w:numPr>
           <w:ilvl w:val="0"/>
           <w:numId w:val="1"/>
@@ -579,6 +663,15 @@
     </w:p>
     <w:p>
       <w:pPr>
+        <w:ind w:left="720"/>
+        <w:jc w:val="both"/>
+      </w:pPr>
+      <w:r>
+        <w:t>Thank you for the valuable comment. The numerical presentation in Table 4 has been reviewed and standardized to maintain a consistent format and appropriate decimal precision across the reported evaluation metrics, while preserving the conventional representation of each metric.</w:t>
+      </w:r>
+    </w:p>
+    <w:p>
+      <w:pPr>
         <w:numPr>
           <w:ilvl w:val="0"/>
           <w:numId w:val="1"/>
@@ -591,6 +684,15 @@
     </w:p>
     <w:p>
       <w:pPr>
+        <w:ind w:left="720"/>
+        <w:jc w:val="both"/>
+      </w:pPr>
+      <w:r>
+        <w:t>Thank you for the valuable comment. The definition and purpose of the “Compatible Prediction Rate” have already been clarified in the manuscript above Table 4, where it is presented as an auxiliary measure for assessing prediction compatibility across datasets with different class configurations.</w:t>
+      </w:r>
+    </w:p>
+    <w:p>
+      <w:pPr>
         <w:numPr>
           <w:ilvl w:val="0"/>
           <w:numId w:val="1"/>
@@ -603,43 +705,54 @@
     </w:p>
     <w:p>
       <w:pPr>
-        <w:numPr>
-          <w:ilvl w:val="0"/>
-          <w:numId w:val="1"/>
-        </w:numPr>
-        <w:jc w:val="both"/>
-      </w:pPr>
-      <w:r>
-        <w:t xml:space="preserve">Table 5 should describe the hardware, batch size, input size, number of </w:t>
-      </w:r>
-      <w:proofErr w:type="gramStart"/>
-      <w:r>
-        <w:t>warm-up</w:t>
-      </w:r>
-      <w:proofErr w:type="gramEnd"/>
-      <w:r>
-        <w:t xml:space="preserve"> runs, number of timed runs, and software environment used to obtain latency and throughput. Without this information, computational comparisons are not fully reproducible.</w:t>
-      </w:r>
-    </w:p>
-    <w:p>
-      <w:pPr>
-        <w:numPr>
-          <w:ilvl w:val="0"/>
-          <w:numId w:val="1"/>
-        </w:numPr>
+        <w:ind w:left="720"/>
         <w:jc w:val="both"/>
       </w:pPr>
       <w:r>
         <w:lastRenderedPageBreak/>
-        <w:t xml:space="preserve">Table 5 compares the proposed model with MobileNetV2, EfficientNetB0, and </w:t>
-      </w:r>
-      <w:proofErr w:type="spellStart"/>
-      <w:r>
-        <w:t>NASNetMobile</w:t>
-      </w:r>
-      <w:proofErr w:type="spellEnd"/>
-      <w:r>
-        <w:t>, but it is unclear whether these models were trained under identical data splits, preprocessing, input dimensions, and optimization conditions. The caption or Methods section should explicitly confirm the fairness of this comparison.</w:t>
+        <w:t>Thank you for the valuable comment. The peak-memory measurements in Table 5 were rechecked, and the reported value for the proposed SE-CNN has been presented with higher numerical precision to avoid rounding it to 0.00 MB. The table and accompanying description have also been clarified to distinguish runtime peak memory usage from the stored model size.</w:t>
+      </w:r>
+    </w:p>
+    <w:p>
+      <w:pPr>
+        <w:numPr>
+          <w:ilvl w:val="0"/>
+          <w:numId w:val="1"/>
+        </w:numPr>
+        <w:jc w:val="both"/>
+      </w:pPr>
+      <w:r>
+        <w:t>Table 5 should describe the hardware, batch size, input size, number of warm-up runs, number of timed runs, and software environment used to obtain latency and throughput. Without this information, computational comparisons are not fully reproducible.</w:t>
+      </w:r>
+    </w:p>
+    <w:p>
+      <w:pPr>
+        <w:ind w:left="720"/>
+        <w:jc w:val="both"/>
+      </w:pPr>
+      <w:r>
+        <w:t>Thank you for the valuable comment. The hardware and experimental configuration used for the computational evaluation, including the input size, batch size, and software environment, are already specified in the manuscript, while the latency and throughput results in Table 5 are reported under the same evaluation procedure described in the Computational Efficiency and Inference Performance section. To avoid redundancy and preserve the concise presentation of Table 5, these methodological details have been retained in the relevant sections of the manuscript rather than duplicated within the table.</w:t>
+      </w:r>
+    </w:p>
+    <w:p>
+      <w:pPr>
+        <w:numPr>
+          <w:ilvl w:val="0"/>
+          <w:numId w:val="1"/>
+        </w:numPr>
+        <w:jc w:val="both"/>
+      </w:pPr>
+      <w:r>
+        <w:t>Table 5 compares the proposed model with MobileNetV2, EfficientNetB0, and NASNetMobile, but it is unclear whether these models were trained under identical data splits, preprocessing, input dimensions, and optimization conditions. The caption or Methods section should explicitly confirm the fairness of this comparison.</w:t>
+      </w:r>
+    </w:p>
+    <w:p>
+      <w:pPr>
+        <w:ind w:left="720"/>
+        <w:jc w:val="both"/>
+      </w:pPr>
+      <w:r>
+        <w:t>Thank you for the valuable comment. The caption of Table 5 has been revised to clarify that the computational efficiency and inference performance of the compared models were evaluated under consistent experimental conditions, including the same data splits, preprocessing, and input dimensions. The table contents have been retained without modification.</w:t>
       </w:r>
     </w:p>
     <w:p>
@@ -656,6 +769,15 @@
     </w:p>
     <w:p>
       <w:pPr>
+        <w:ind w:left="720"/>
+        <w:jc w:val="both"/>
+      </w:pPr>
+      <w:r>
+        <w:t>Thank you for the valuable comment. The computational evaluation procedure has been further clarified in Section III-B, including the profiling method, FLOPs/MACs convention, warm-up runs, and inference timing procedure. These details have been added to improve the reproducibility and transparency of the reported computational results.</w:t>
+      </w:r>
+    </w:p>
+    <w:p>
+      <w:pPr>
         <w:numPr>
           <w:ilvl w:val="0"/>
           <w:numId w:val="1"/>
@@ -668,6 +790,15 @@
     </w:p>
     <w:p>
       <w:pPr>
+        <w:ind w:left="720"/>
+        <w:jc w:val="both"/>
+      </w:pPr>
+      <w:r>
+        <w:t>Thank you we have changed the text to actual 97%.</w:t>
+      </w:r>
+    </w:p>
+    <w:p>
+      <w:pPr>
         <w:numPr>
           <w:ilvl w:val="0"/>
           <w:numId w:val="1"/>
@@ -680,18 +811,37 @@
     </w:p>
     <w:p>
       <w:pPr>
-        <w:numPr>
-          <w:ilvl w:val="0"/>
-          <w:numId w:val="1"/>
-        </w:numPr>
-        <w:jc w:val="both"/>
-      </w:pPr>
-      <w:r>
+        <w:ind w:left="720"/>
+        <w:jc w:val="both"/>
+      </w:pPr>
+      <w:r>
+        <w:t>Thank you for the valuable comment. The caption of Table 6 has been revised to explicitly indicate that the cross-dataset evaluation involves only the four shared classes, ensuring clear interpretation of the reported results.</w:t>
+      </w:r>
+    </w:p>
+    <w:p>
+      <w:pPr>
+        <w:numPr>
+          <w:ilvl w:val="0"/>
+          <w:numId w:val="1"/>
+        </w:numPr>
+        <w:jc w:val="both"/>
+      </w:pPr>
+      <w:r>
+        <w:lastRenderedPageBreak/>
         <w:t>Table 7 provides useful ablation configurations, but the design is not fully factorial. For example, there is no “SE = No, Augmentation = Yes, SGD” configuration. Therefore, the independent effects of each component cannot be completely separated.</w:t>
       </w:r>
     </w:p>
     <w:p>
       <w:pPr>
+        <w:ind w:left="720"/>
+        <w:jc w:val="both"/>
+      </w:pPr>
+      <w:r>
+        <w:t>Thank you for the valuable comment. We acknowledge that the ablation study is not a complete factorial design; therefore, Table 8 has been used to present controlled pairwise comparisons of the tested configurations and their corresponding percentage-point changes. The manuscript has been clarified accordingly, and the interpretation has been limited to the effects observed within these tested comparisons rather than claiming complete independent factor separation.</w:t>
+      </w:r>
+    </w:p>
+    <w:p>
+      <w:pPr>
         <w:numPr>
           <w:ilvl w:val="0"/>
           <w:numId w:val="1"/>
@@ -704,6 +854,15 @@
     </w:p>
     <w:p>
       <w:pPr>
+        <w:ind w:left="720"/>
+        <w:jc w:val="both"/>
+      </w:pPr>
+      <w:r>
+        <w:t>Thank you for the valuable comment. Table 7 has been retained as a concise presentation of the individual ablation configurations and their observed accuracy values, while the repeated five-seed evaluation and corresponding mean ± SD are reported separately for the proposed model in Table 4. The interpretation of the small percentage-point differences in Table 8 has therefore been kept limited to the tested pairwise comparisons, without treating these differences as statistically established effects.</w:t>
+      </w:r>
+    </w:p>
+    <w:p>
+      <w:pPr>
         <w:numPr>
           <w:ilvl w:val="0"/>
           <w:numId w:val="1"/>
@@ -716,6 +875,15 @@
     </w:p>
     <w:p>
       <w:pPr>
+        <w:ind w:left="720"/>
+        <w:jc w:val="both"/>
+      </w:pPr>
+      <w:r>
+        <w:t>Thank you for the valuable comment. We acknowledge that the comparisons in Table 8 are controlled pairwise comparisons rather than strictly equivalent causal estimates, as the component effects are evaluated under different tested configurations. Accordingly, the manuscript has been clarified to describe these results as observed component contributions within the tested configurations, avoiding interpretation as fully independent causal effects.</w:t>
+      </w:r>
+    </w:p>
+    <w:p>
+      <w:pPr>
         <w:numPr>
           <w:ilvl w:val="0"/>
           <w:numId w:val="1"/>
@@ -728,6 +896,15 @@
     </w:p>
     <w:p>
       <w:pPr>
+        <w:ind w:left="720"/>
+        <w:jc w:val="both"/>
+      </w:pPr>
+      <w:r>
+        <w:t>Thank you for the valuable comment. Table 8 has been retained as a concise summary of the observed percentage-point changes from the tested pairwise ablation configurations, while the repeated-run mean ± SD analysis is reported separately for the main cross-dataset evaluation in Table 4. The interpretation has been limited to the observed differences within the tested configurations, without presenting the relatively small changes as statistically established improvements.</w:t>
+      </w:r>
+    </w:p>
+    <w:p>
+      <w:pPr>
         <w:numPr>
           <w:ilvl w:val="0"/>
           <w:numId w:val="1"/>
@@ -740,6 +917,19 @@
     </w:p>
     <w:p>
       <w:pPr>
+        <w:ind w:left="720"/>
+        <w:jc w:val="both"/>
+      </w:pPr>
+      <w:r>
+        <w:t xml:space="preserve">Thank you for the valuable comment. The manuscript already provides the relevant information on dataset classes, evaluation protocols, parameter count, and the use of pretrained/transfer-learning approaches in the corresponding methodological and literature-review sections, while Table 9 provides the available quantitative benchmarking results. To </w:t>
+      </w:r>
+      <w:r>
+        <w:lastRenderedPageBreak/>
+        <w:t>avoid duplicating information and introducing details that were not reported in the original studies, the comparison has been interpreted together with these supporting sections, and unavailable study-specific details are treated as not reported.</w:t>
+      </w:r>
+    </w:p>
+    <w:p>
+      <w:pPr>
         <w:numPr>
           <w:ilvl w:val="0"/>
           <w:numId w:val="1"/>
@@ -752,6 +942,15 @@
     </w:p>
     <w:p>
       <w:pPr>
+        <w:ind w:left="720"/>
+        <w:jc w:val="both"/>
+      </w:pPr>
+      <w:r>
+        <w:t>Thank you for the valuable comment. The manuscript already explicitly acknowledges that the accuracy values reported in Table 9 are taken from the respective publications and are not strictly equivalent benchmark results, since the studies differ in network architecture, preprocessing, data augmentation, dataset partitioning, and evaluation protocols. Accordingly, Table 9 is intended as a reference-based literature comparison rather than a directly controlled comparison across identical tasks and experimental settings.</w:t>
+      </w:r>
+    </w:p>
+    <w:p>
+      <w:pPr>
         <w:numPr>
           <w:ilvl w:val="0"/>
           <w:numId w:val="1"/>
@@ -764,22 +963,134 @@
     </w:p>
     <w:p>
       <w:pPr>
-        <w:numPr>
-          <w:ilvl w:val="0"/>
-          <w:numId w:val="1"/>
-        </w:numPr>
-        <w:jc w:val="both"/>
-      </w:pPr>
-      <w:r>
-        <w:t xml:space="preserve">Table 9 lists </w:t>
-      </w:r>
-      <w:proofErr w:type="spellStart"/>
-      <w:r>
-        <w:t>Stanojević</w:t>
-      </w:r>
-      <w:proofErr w:type="spellEnd"/>
-      <w:r>
-        <w:t xml:space="preserve"> et al. as 2024, whereas the reference-list metadata appears inconsistent with that year. The publication year and corresponding table entry should be verified.</w:t>
+        <w:ind w:left="720"/>
+        <w:jc w:val="both"/>
+      </w:pPr>
+      <w:r>
+        <w:t>We have changed to 97%</w:t>
+      </w:r>
+    </w:p>
+    <w:p>
+      <w:pPr>
+        <w:numPr>
+          <w:ilvl w:val="0"/>
+          <w:numId w:val="1"/>
+        </w:numPr>
+        <w:jc w:val="both"/>
+      </w:pPr>
+      <w:r>
+        <w:t>Table 9 lists Stanojević et al. as 2024, whereas the reference-list metadata appears inconsistent with that year. The publication year and corresponding table entry should be verified.</w:t>
+      </w:r>
+    </w:p>
+    <w:p>
+      <w:pPr>
+        <w:ind w:left="720"/>
+        <w:jc w:val="both"/>
+      </w:pPr>
+      <w:r>
+        <w:t>We have changed it to 2022.</w:t>
+      </w:r>
+    </w:p>
+    <w:p>
+      <w:pPr>
+        <w:numPr>
+          <w:ilvl w:val="0"/>
+          <w:numId w:val="1"/>
+        </w:numPr>
+        <w:jc w:val="both"/>
+      </w:pPr>
+      <w:r>
+        <w:t>All table captions should follow one consistent format. The manuscript currently uses both “Table 1:” and “Table 2.” styles. Use one journal-standard convention, preferably “Table 1. …”.</w:t>
+      </w:r>
+    </w:p>
+    <w:p>
+      <w:pPr>
+        <w:ind w:left="720"/>
+        <w:jc w:val="both"/>
+      </w:pPr>
+      <w:r>
+        <w:t>We have changed to represent the uniformity.</w:t>
+      </w:r>
+    </w:p>
+    <w:p>
+      <w:pPr>
+        <w:numPr>
+          <w:ilvl w:val="0"/>
+          <w:numId w:val="1"/>
+        </w:numPr>
+        <w:jc w:val="both"/>
+      </w:pPr>
+      <w:r>
+        <w:t>All figure captions should similarly use consistent capitalization, punctuation, spacing, and panel notation. For example, “Fig. 5 (a)” and “Fig. 6 (a).” should be standardized.</w:t>
+      </w:r>
+    </w:p>
+    <w:p>
+      <w:pPr>
+        <w:ind w:left="720"/>
+        <w:jc w:val="both"/>
+      </w:pPr>
+      <w:r>
+        <w:t>We have standardized.</w:t>
+      </w:r>
+    </w:p>
+    <w:p>
+      <w:pPr>
+        <w:numPr>
+          <w:ilvl w:val="0"/>
+          <w:numId w:val="1"/>
+        </w:numPr>
+        <w:jc w:val="both"/>
+      </w:pPr>
+      <w:r>
+        <w:t>Every figure and table should be explicitly cited in numerical order in the main text before or close to its appearance. The sentence around Table 4 is incomplete (“summarized in .”), indicating a missing table citation that must be corrected.</w:t>
+      </w:r>
+    </w:p>
+    <w:p>
+      <w:pPr>
+        <w:ind w:left="720"/>
+        <w:jc w:val="both"/>
+      </w:pPr>
+      <w:r>
+        <w:t>After that there is a reference to Table 4.</w:t>
+      </w:r>
+    </w:p>
+    <w:p>
+      <w:pPr>
+        <w:numPr>
+          <w:ilvl w:val="0"/>
+          <w:numId w:val="1"/>
+        </w:numPr>
+        <w:jc w:val="both"/>
+      </w:pPr>
+      <w:r>
+        <w:t>The maximum visual density should also be considered. Several pages contain a large table together with figures or substantial text. For readability, figures and tables should be redistributed so that preferably no more than two major visual elements appear on a single page.</w:t>
+      </w:r>
+    </w:p>
+    <w:p>
+      <w:pPr>
+        <w:ind w:left="720"/>
+        <w:jc w:val="both"/>
+      </w:pPr>
+      <w:r>
+        <w:t xml:space="preserve">We tried to reformat it but two column and </w:t>
+      </w:r>
+      <w:r>
+        <w:t>journal’s</w:t>
+      </w:r>
+      <w:r>
+        <w:t xml:space="preserve"> limited criteria limiting us to modify the same. It would be very good if </w:t>
+      </w:r>
+      <w:r>
+        <w:t>journal’s</w:t>
+      </w:r>
+      <w:r>
+        <w:t xml:space="preserve"> editorial team </w:t>
+      </w:r>
+      <w:r>
+        <w:t>would</w:t>
+      </w:r>
+      <w:r>
+        <w:t xml:space="preserve"> do it.</w:t>
       </w:r>
     </w:p>
     <w:p>
@@ -792,67 +1103,20 @@
       </w:pPr>
       <w:r>
         <w:lastRenderedPageBreak/>
-        <w:t>All table captions should follow one consistent format. The manuscript currently uses both “Table 1:” and “Table 2.” styles. Use one journal-standard convention, preferably “Table 1. …”.</w:t>
-      </w:r>
-    </w:p>
-    <w:p>
-      <w:pPr>
-        <w:numPr>
-          <w:ilvl w:val="0"/>
-          <w:numId w:val="1"/>
-        </w:numPr>
-        <w:jc w:val="both"/>
-      </w:pPr>
-      <w:r>
-        <w:t>All figure captions should similarly use consistent capitalization, punctuation, spacing, and panel notation. For example, “Fig. 5 (a)” and “Fig. 6 (a).” should be standardized.</w:t>
-      </w:r>
-    </w:p>
-    <w:p>
-      <w:pPr>
-        <w:numPr>
-          <w:ilvl w:val="0"/>
-          <w:numId w:val="1"/>
-        </w:numPr>
-        <w:jc w:val="both"/>
-      </w:pPr>
-      <w:r>
-        <w:t xml:space="preserve">Every figure and table should be explicitly cited in numerical order in the main text before or close to its appearance. The sentence around Table 4 is incomplete (“summarized </w:t>
-      </w:r>
-      <w:proofErr w:type="gramStart"/>
-      <w:r>
-        <w:t>in .</w:t>
-      </w:r>
-      <w:proofErr w:type="gramEnd"/>
-      <w:r>
-        <w:t>”), indicating a missing table citation that must be corrected.</w:t>
-      </w:r>
-    </w:p>
-    <w:p>
-      <w:pPr>
-        <w:numPr>
-          <w:ilvl w:val="0"/>
-          <w:numId w:val="1"/>
-        </w:numPr>
-        <w:jc w:val="both"/>
-      </w:pPr>
-      <w:r>
-        <w:t>The maximum visual density should also be considered. Several pages contain a large table together with figures or substantial text. For readability, figures and tables should be redistributed so that preferably no more than two major visual elements appear on a single page.</w:t>
-      </w:r>
-    </w:p>
-    <w:p>
-      <w:pPr>
-        <w:numPr>
-          <w:ilvl w:val="0"/>
-          <w:numId w:val="1"/>
-        </w:numPr>
-        <w:jc w:val="both"/>
-      </w:pPr>
-      <w:r>
         <w:t>The manuscript would benefit from a dedicated dataset-distribution table showing training, validation, and test counts for every class in OCT-C8 and OCT2017. This would improve transparency of the experimental design.</w:t>
       </w:r>
     </w:p>
     <w:p>
       <w:pPr>
+        <w:ind w:left="720"/>
+        <w:jc w:val="both"/>
+      </w:pPr>
+      <w:r>
+        <w:t>We have already provided all the information in the manuscript in different sections.</w:t>
+      </w:r>
+    </w:p>
+    <w:p>
+      <w:pPr>
         <w:numPr>
           <w:ilvl w:val="0"/>
           <w:numId w:val="1"/>
@@ -861,6 +1125,15 @@
       </w:pPr>
       <w:r>
         <w:t>Before acceptance, the authors should perform a final numerical audit connecting every value in Figures 4–7 and Tables 3–9 with the raw experimental outputs. The most important issues requiring correction are the 96.71% versus 97.00% OCT-C8 accuracy discrepancy, Table 5 memory values, the non-equivalent four-class versus eight-class comparison in Table 6, incomplete ablation design, and missing ROC figures.</w:t>
+      </w:r>
+    </w:p>
+    <w:p>
+      <w:pPr>
+        <w:ind w:left="720"/>
+        <w:jc w:val="both"/>
+      </w:pPr>
+      <w:r>
+        <w:t>Thank you for the valuable comment. We have carefully reviewed the numerical consistency of Figures 4–7 and Tables 3–9 and addressed the identified issues, including standardizing the OCT-C8 accuracy to 97%, reviewing the reported memory values in Table 5, clarifying the four-class cross-dataset evaluation versus the eight-class OCT-C8 evaluation, and refining the interpretation of the ablation study to reflect its pairwise rather than fully factorial design. The cross-dataset evaluation is explicitly restricted to the four classes shared by OCT-C8 and OCT2017, while the within-dataset OCT-C8 evaluation uses all eight classes. The numerical results and corresponding figures/tables have been cross-checked for consistency, and the ROC-AUC results are reported quantitatively in the evaluation tables.</w:t>
       </w:r>
     </w:p>
     <w:p>
@@ -1603,6 +1876,7 @@
   <w:style w:type="character" w:default="1" w:styleId="DefaultParagraphFont">
     <w:name w:val="Default Paragraph Font"/>
     <w:uiPriority w:val="1"/>
+    <w:semiHidden/>
     <w:unhideWhenUsed/>
   </w:style>
   <w:style w:type="table" w:default="1" w:styleId="TableNormal">

</xml_diff>